<commit_message>
minor updates to course desc
</commit_message>
<xml_diff>
--- a/CGU-workshops-description-2026-08.docx
+++ b/CGU-workshops-description-2026-08.docx
@@ -200,7 +200,7 @@
           <w:b w:val="false"/>
           <w:bCs w:val="false"/>
         </w:rPr>
-        <w:t>Understand how to find the same file in the file explorer and the IDE and using bash, R, and python</w:t>
+        <w:t>Find the same file via the file explorer, the IDE, and bash, R, and python commands</w:t>
       </w:r>
     </w:p>
     <w:p>
@@ -480,27 +480,27 @@
           <w:b w:val="false"/>
           <w:bCs w:val="false"/>
         </w:rPr>
-        <w:t>Using quarto to document and explain analysis and make it reproducible</w:t>
-      </w:r>
-    </w:p>
-    <w:p>
-      <w:pPr>
-        <w:pStyle w:val="Normal"/>
-        <w:bidi w:val="0"/>
-        <w:jc w:val="start"/>
-        <w:rPr>
-          <w:rFonts w:ascii="Liberation Sans" w:hAnsi="Liberation Sans"/>
-          <w:b w:val="false"/>
-          <w:bCs w:val="false"/>
-        </w:rPr>
-      </w:pPr>
-      <w:r>
-        <w:rPr>
-          <w:rFonts w:ascii="Liberation Sans" w:hAnsi="Liberation Sans"/>
-          <w:b w:val="false"/>
-          <w:bCs w:val="false"/>
-        </w:rPr>
-        <w:t>Adding interactive elements to quarto documents / dashboards</w:t>
+        <w:t>Using Quarto to document and explain analysis and make it reproducible</w:t>
+      </w:r>
+    </w:p>
+    <w:p>
+      <w:pPr>
+        <w:pStyle w:val="Normal"/>
+        <w:bidi w:val="0"/>
+        <w:jc w:val="start"/>
+        <w:rPr>
+          <w:rFonts w:ascii="Liberation Sans" w:hAnsi="Liberation Sans"/>
+          <w:b w:val="false"/>
+          <w:bCs w:val="false"/>
+        </w:rPr>
+      </w:pPr>
+      <w:r>
+        <w:rPr>
+          <w:rFonts w:ascii="Liberation Sans" w:hAnsi="Liberation Sans"/>
+          <w:b w:val="false"/>
+          <w:bCs w:val="false"/>
+        </w:rPr>
+        <w:t>Adding interactive elements to Quarto documents / dashboards</w:t>
       </w:r>
     </w:p>
     <w:p>
@@ -637,13 +637,7 @@
         <w:rPr>
           <w:rFonts w:ascii="Liberation Sans" w:hAnsi="Liberation Sans"/>
         </w:rPr>
-        <w:t>We</w:t>
-      </w:r>
-      <w:r>
-        <w:rPr>
-          <w:rFonts w:ascii="Liberation Sans" w:hAnsi="Liberation Sans"/>
-        </w:rPr>
-        <w:t xml:space="preserve"> will start with a brief overview of technologies for single-cell (or single-nucleus) RNA-seq and of the range of scientific questions that can be addressed with these technologies. We will use R and the R Seurat analysis packages to analyze a single-sample single-cell RNA-seq experiment.</w:t>
+        <w:t>We will start with a brief overview of technologies for single-cell (or single-nucleus) RNA-seq and of the range of scientific questions that can be addressed with these technologies. We will use R and the R Seurat analysis packages to analyze a single-sample single-cell RNA-seq experiment.</w:t>
       </w:r>
     </w:p>
     <w:p>
@@ -750,13 +744,7 @@
         <w:rPr>
           <w:rFonts w:ascii="Liberation Sans" w:hAnsi="Liberation Sans"/>
         </w:rPr>
-        <w:t>We</w:t>
-      </w:r>
-      <w:r>
-        <w:rPr>
-          <w:rFonts w:ascii="Liberation Sans" w:hAnsi="Liberation Sans"/>
-        </w:rPr>
-        <w:t xml:space="preserve"> will start with a brief overview of technologies for single-cell RNA-seq, CITE-seq (simultaneously generated RNA-seq with barcoded cell-surface antibodies) and single-cell ATAC-seq. We will go through several approaches to analyzing CITE-seq data and to analyzing combined RNA-seq and ATAC-seq data.</w:t>
+        <w:t>We will start with a brief overview of technologies for single-cell RNA-seq, CITE-seq (simultaneously generated RNA-seq with barcoded cell-surface antibodies) and single-cell ATAC-seq. We will go through several approaches to analyzing CITE-seq data and to analyzing combined RNA-seq and ATAC-seq data.</w:t>
       </w:r>
     </w:p>
     <w:p>
@@ -828,7 +816,7 @@
           <w:bCs/>
           <w:shd w:fill="C0C0C0" w:val="clear"/>
         </w:rPr>
-        <w:t>Single-cell trajectories and differential expression and cell type composition</w:t>
+        <w:t>Single-cell trajectories, differential expression, and cell-type composition</w:t>
       </w:r>
     </w:p>
     <w:p>
@@ -1008,13 +996,7 @@
           <w:b/>
           <w:bCs/>
         </w:rPr>
-        <w:t>Background needed:</w:t>
-      </w:r>
-      <w:r>
-        <w:rPr>
-          <w:rFonts w:ascii="Liberation Sans" w:hAnsi="Liberation Sans"/>
-        </w:rPr>
-        <w:t xml:space="preserve"> All the workshops except the Monday morning workshop assume basic knowledge of R and RStudio (or VS Code / Positron)</w:t>
+        <w:t>Background needed: All the workshops except the Monday morning workshop assume basic knowledge of R and RStudio (or VS Code / Positron).</w:t>
       </w:r>
     </w:p>
     <w:p>
@@ -1114,21 +1096,7 @@
           <w:rFonts w:ascii="Liberation Sans" w:hAnsi="Liberation Sans"/>
           <w:shd w:fill="auto" w:val="clear"/>
         </w:rPr>
-        <w:t>A</w:t>
-      </w:r>
-      <w:r>
-        <w:rPr>
-          <w:rFonts w:ascii="Liberation Sans" w:hAnsi="Liberation Sans"/>
-          <w:shd w:fill="auto" w:val="clear"/>
-        </w:rPr>
-        <w:t xml:space="preserve"> recent version of R </w:t>
-      </w:r>
-      <w:r>
-        <w:rPr>
-          <w:rFonts w:ascii="Liberation Sans" w:hAnsi="Liberation Sans"/>
-          <w:shd w:fill="auto" w:val="clear"/>
-        </w:rPr>
-        <w:t>(4.5.x or 4.6.x)</w:t>
+        <w:t>A recent version of R (4.5.x or 4.6.x)</w:t>
       </w:r>
     </w:p>
     <w:p>
@@ -1151,21 +1119,7 @@
           <w:rFonts w:ascii="Liberation Sans" w:hAnsi="Liberation Sans"/>
           <w:shd w:fill="auto" w:val="clear"/>
         </w:rPr>
-        <w:t>Y</w:t>
-      </w:r>
-      <w:r>
-        <w:rPr>
-          <w:rFonts w:ascii="Liberation Sans" w:hAnsi="Liberation Sans"/>
-          <w:shd w:fill="auto" w:val="clear"/>
-        </w:rPr>
-        <w:t xml:space="preserve">our choice of RStudio, Positron, or VS Code. </w:t>
-      </w:r>
-      <w:r>
-        <w:rPr>
-          <w:rFonts w:ascii="Liberation Sans" w:hAnsi="Liberation Sans"/>
-          <w:shd w:fill="auto" w:val="clear"/>
-        </w:rPr>
-        <w:t>The workshop will be using RStudio</w:t>
+        <w:t>Your choice of RStudio, Positron, or VS Code. The workshop will be using RStudio</w:t>
       </w:r>
     </w:p>
     <w:p>
@@ -1184,14 +1138,7 @@
           <w:rFonts w:ascii="Liberation Sans" w:hAnsi="Liberation Sans"/>
           <w:shd w:fill="auto" w:val="clear"/>
         </w:rPr>
-        <w:t>R packages and data sets listed at</w:t>
-      </w:r>
-      <w:r>
-        <w:rPr>
-          <w:rFonts w:ascii="Liberation Sans" w:hAnsi="Liberation Sans"/>
-          <w:shd w:fill="auto" w:val="clear"/>
-        </w:rPr>
-        <w:t xml:space="preserve"> </w:t>
+        <w:t xml:space="preserve">R packages and data sets listed at </w:t>
       </w:r>
       <w:hyperlink r:id="rId2">
         <w:r>
@@ -1254,28 +1201,21 @@
           <w:rFonts w:ascii="Liberation Sans" w:hAnsi="Liberation Sans"/>
           <w:shd w:fill="auto" w:val="clear"/>
         </w:rPr>
-        <w:t>A</w:t>
+        <w:t xml:space="preserve">Additional packages and data sets </w:t>
       </w:r>
       <w:r>
         <w:rPr>
           <w:rFonts w:ascii="Liberation Sans" w:hAnsi="Liberation Sans"/>
           <w:shd w:fill="auto" w:val="clear"/>
         </w:rPr>
-        <w:t xml:space="preserve">dditional packages and data sets might be added as </w:t>
+        <w:t xml:space="preserve">will </w:t>
       </w:r>
       <w:r>
         <w:rPr>
           <w:rFonts w:ascii="Liberation Sans" w:hAnsi="Liberation Sans"/>
           <w:shd w:fill="auto" w:val="clear"/>
         </w:rPr>
-        <w:t>we</w:t>
-      </w:r>
-      <w:r>
-        <w:rPr>
-          <w:rFonts w:ascii="Liberation Sans" w:hAnsi="Liberation Sans"/>
-          <w:shd w:fill="auto" w:val="clear"/>
-        </w:rPr>
-        <w:t xml:space="preserve"> test workshop examples prior to the course, so please check back a week before the workshop. </w:t>
+        <w:t xml:space="preserve">be added as we test workshop examples prior to the course, so please check back a week before the workshop. </w:t>
       </w:r>
     </w:p>
     <w:sectPr>
@@ -1603,8 +1543,8 @@
       <w:bCs/>
     </w:rPr>
   </w:style>
-  <w:style w:type="character" w:styleId="Bulletsuser">
-    <w:name w:val="Bullets (user)"/>
+  <w:style w:type="character" w:styleId="Bullets">
+    <w:name w:val="Bullets"/>
     <w:qFormat/>
     <w:rPr>
       <w:rFonts w:ascii="OpenSymbol" w:hAnsi="OpenSymbol" w:eastAsia="OpenSymbol" w:cs="OpenSymbol"/>

</xml_diff>